<commit_message>
Add 20 verified Kaggle figures and conference writing package
</commit_message>
<xml_diff>
--- a/docs/docx/DATASETS.docx
+++ b/docs/docx/DATASETS.docx
@@ -1751,6 +1751,35 @@
         <w:t>The project does not have prospective consent, site-level provenance or external clinical validation information beyond the supplied public dataset records. This documentation concerns research benchmarking and does not establish clinical utility.</w:t>
       </w:r>
     </w:p>
+    <w:p>
+      <w:pPr>
+        <w:pStyle w:val="Heading2"/>
+      </w:pPr>
+      <w:r>
+        <w:t>Derived conference figure evidence</w:t>
+      </w:r>
+    </w:p>
+    <w:p>
+      <w:r>
+        <w:t xml:space="preserve">The private </w:t>
+      </w:r>
+      <w:hyperlink r:id="rId14">
+        <w:r>
+          <w:rPr>
+            <w:color w:val="176B87"/>
+          </w:rPr>
+          <w:t>MRI Conference Figure Evidence</w:t>
+        </w:r>
+      </w:hyperlink>
+      <w:r>
+        <w:t xml:space="preserve"> dataset, version 1, is a small reproducibility attachment for the completed 20-figure CPU notebook. It packages the already verified result/audit tables, plotting source and attributed qualitative montage. It adds no cases, labels, patient information, raw MRI arrays or checkpoints to the scientific study.</w:t>
+      </w:r>
+    </w:p>
+    <w:p>
+      <w:r>
+        <w:t>The attachment uses Kaggle's “Other (specified in description)” license category to retain separate source terms. The derived montage remains CC BY-SA 4.0 with its bundled attribution. No new source-code license or whole-bundle open license is assigned. File hashes and the originating experiment-release revision are recorded in the evidence manifest; the notebook checks every input before rendering.</w:t>
+      </w:r>
+    </w:p>
     <w:sectPr>
       <w:headerReference w:type="default" r:id="rId9"/>
       <w:footerReference w:type="default" r:id="rId10"/>

</xml_diff>